<commit_message>
M15: capturas y manuales generados por la CI
</commit_message>
<xml_diff>
--- a/SISTEMA WEB/ayni/1. INICIO/MANUAL/Manual de instalación.docx
+++ b/SISTEMA WEB/ayni/1. INICIO/MANUAL/Manual de instalación.docx
@@ -2003,7 +2003,7 @@
               <w:jc w:val="left"/>
             </w:pPr>
             <w:r>
-              <w:t xml:space="preserve">Abre Docker Desktop si está cerrado, enciende los servicios, espera a que respondan y abre el navegador</w:t>
+              <w:t xml:space="preserve">Abre Docker Desktop si está cerrado, reconstruye AYNI si la carpeta se actualizó, enciende los servicios, espera a que respondan y abre el navegador</w:t>
             </w:r>
           </w:p>
         </w:tc>
@@ -4432,6 +4432,72 @@
             </w:r>
             <w:r>
               <w:t xml:space="preserve">para ver los registros</w:t>
+            </w:r>
+          </w:p>
+        </w:tc>
+      </w:tr>
+      <w:tr>
+        <w:tc>
+          <w:tcPr/>
+          <w:p>
+            <w:pPr>
+              <w:pStyle w:val="Compact"/>
+              <w:jc w:val="left"/>
+            </w:pPr>
+            <w:r>
+              <w:t xml:space="preserve">Actualicé la carpeta de AYNI y sigo viendo la versión anterior (por ejemplo,</w:t>
+            </w:r>
+            <w:r>
+              <w:t xml:space="preserve"> </w:t>
+            </w:r>
+            <w:r>
+              <w:t xml:space="preserve">“</w:t>
+            </w:r>
+            <w:r>
+              <w:t xml:space="preserve">Vista previa del diseño</w:t>
+            </w:r>
+            <w:r>
+              <w:t xml:space="preserve">”</w:t>
+            </w:r>
+            <w:r>
+              <w:t xml:space="preserve"> </w:t>
+            </w:r>
+            <w:r>
+              <w:t xml:space="preserve">en el inicio)</w:t>
+            </w:r>
+          </w:p>
+        </w:tc>
+        <w:tc>
+          <w:tcPr/>
+          <w:p>
+            <w:pPr>
+              <w:pStyle w:val="Compact"/>
+              <w:jc w:val="left"/>
+            </w:pPr>
+            <w:r>
+              <w:t xml:space="preserve">Opción</w:t>
+            </w:r>
+            <w:r>
+              <w:t xml:space="preserve"> </w:t>
+            </w:r>
+            <w:r>
+              <w:rPr>
+                <w:rStyle w:val="VerbatimChar"/>
+              </w:rPr>
+              <w:t xml:space="preserve">3</w:t>
+            </w:r>
+            <w:r>
+              <w:t xml:space="preserve">: al encender, el panel reconstruye AYNI si el código cambió (la primera vez tarda unos minutos). Si aún se ve igual, recarga con</w:t>
+            </w:r>
+            <w:r>
+              <w:t xml:space="preserve"> </w:t>
+            </w:r>
+            <w:r>
+              <w:rPr>
+                <w:bCs/>
+                <w:b/>
+              </w:rPr>
+              <w:t xml:space="preserve">Ctrl + F5</w:t>
             </w:r>
           </w:p>
         </w:tc>

</xml_diff>

<commit_message>
Manuales: AYNI publicado en https://ayni.ruta-practica.com/ y cuentas de demostración en Requisitos de acceso
</commit_message>
<xml_diff>
--- a/SISTEMA WEB/ayni/1. INICIO/MANUAL/Manual de instalación.docx
+++ b/SISTEMA WEB/ayni/1. INICIO/MANUAL/Manual de instalación.docx
@@ -31,7 +31,7 @@
         <w:pStyle w:val="Date"/>
       </w:pPr>
       <w:r>
-        <w:t xml:space="preserve">21 de octubre de 2026</w:t>
+        <w:t xml:space="preserve">22 de octubre de 2026</w:t>
       </w:r>
     </w:p>
     <w:sdt>
@@ -168,7 +168,7 @@
               <w:jc w:val="left"/>
             </w:pPr>
             <w:r>
-              <w:t xml:space="preserve">Un navegador. Dirección: https://aplicacionenlanube.cetivirgendelapuerta.com/grupo02/</w:t>
+              <w:t xml:space="preserve">Un navegador. Dirección: https://ayni.ruta-practica.com/</w:t>
             </w:r>
           </w:p>
         </w:tc>
@@ -280,7 +280,7 @@
         </w:numPr>
       </w:pPr>
       <w:r>
-        <w:t xml:space="preserve">Abre https://aplicacionenlanube.cetivirgendelapuerta.com/grupo02/ en cualquier navegador, también desde el celular con datos móviles. Siempre se abre con</w:t>
+        <w:t xml:space="preserve">Abre https://ayni.ruta-practica.com/ en cualquier navegador, también desde el celular con datos móviles. Siempre se abre con</w:t>
       </w:r>
       <w:r>
         <w:t xml:space="preserve"> </w:t>
@@ -660,23 +660,7 @@
         </w:numPr>
       </w:pPr>
       <w:r>
-        <w:t xml:space="preserve">En la web los correos de recuperación</w:t>
-      </w:r>
-      <w:r>
-        <w:t xml:space="preserve"> </w:t>
-      </w:r>
-      <w:r>
-        <w:rPr>
-          <w:bCs/>
-          <w:b/>
-        </w:rPr>
-        <w:t xml:space="preserve">sí llegan</w:t>
-      </w:r>
-      <w:r>
-        <w:t xml:space="preserve"> </w:t>
-      </w:r>
-      <w:r>
-        <w:t xml:space="preserve">a la bandeja real del usuario (desde la cuenta Gmail del proyecto).</w:t>
+        <w:t xml:space="preserve">En la web los correos de recuperación de contraseña se envían a la bandeja real del usuario, desde la cuenta de correo del proyecto.</w:t>
       </w:r>
     </w:p>
     <w:p>
@@ -684,7 +668,16 @@
         <w:pStyle w:val="FirstParagraph"/>
       </w:pPr>
       <w:r>
-        <w:t xml:space="preserve">Por seguridad, desde el navegador solo se ve el sistema: el código, la configuración (</w:t>
+        <w:t xml:space="preserve">Por seguridad, desde el navegador solo se ve el sistema: el servidor publica únicamente la parte visible (</w:t>
+      </w:r>
+      <w:r>
+        <w:rPr>
+          <w:rStyle w:val="VerbatimChar"/>
+        </w:rPr>
+        <w:t xml:space="preserve">backend/public</w:t>
+      </w:r>
+      <w:r>
+        <w:t xml:space="preserve">). El código, la configuración (</w:t>
       </w:r>
       <w:r>
         <w:rPr>
@@ -732,20 +725,7 @@
         <w:t xml:space="preserve"> </w:t>
       </w:r>
       <w:r>
-        <w:t xml:space="preserve">y los manuales responden</w:t>
-      </w:r>
-      <w:r>
-        <w:t xml:space="preserve"> </w:t>
-      </w:r>
-      <w:r>
-        <w:rPr>
-          <w:bCs/>
-          <w:b/>
-        </w:rPr>
-        <w:t xml:space="preserve">403 Prohibido</w:t>
-      </w:r>
-      <w:r>
-        <w:t xml:space="preserve">. Esos archivos solo se descargan por FTP.</w:t>
+        <w:t xml:space="preserve">y los manuales no se pueden abrir desde la web; solo se descargan por FTP o SFTP.</w:t>
       </w:r>
     </w:p>
     <w:bookmarkEnd w:id="20"/>
@@ -772,22 +752,7 @@
         <w:pStyle w:val="FirstParagraph"/>
       </w:pPr>
       <w:r>
-        <w:t xml:space="preserve">La carpeta</w:t>
-      </w:r>
-      <w:r>
-        <w:t xml:space="preserve"> </w:t>
-      </w:r>
-      <w:r>
-        <w:rPr>
-          <w:rStyle w:val="VerbatimChar"/>
-        </w:rPr>
-        <w:t xml:space="preserve">grupo02</w:t>
-      </w:r>
-      <w:r>
-        <w:t xml:space="preserve"> </w:t>
-      </w:r>
-      <w:r>
-        <w:t xml:space="preserve">del FTP es</w:t>
+        <w:t xml:space="preserve">La carpeta del sistema en el servidor (por FTP o SFTP) es</w:t>
       </w:r>
       <w:r>
         <w:t xml:space="preserve"> </w:t>

</xml_diff>